<commit_message>
Align internal files with final design: rewrite CN draft, migrate Activity Guide into Session_Design.docx, remove stale session design
</commit_message>
<xml_diff>
--- a/Session_Design.docx
+++ b/Session_Design.docx
@@ -12036,6 +12036,750 @@
           <w:szCs w:val="24"/>
         </w:rPr>
       </w:pPr>
+    </w:p>
+    <w:p>
+      <w:pPr>
+        <w:pageBreakBefore/>
+      </w:pPr>
+      <w:r>
+        <w:rPr>
+          <w:rFonts w:hint="default" w:ascii="Times New Roman Bold" w:hAnsi="Times New Roman Bold" w:cs="Times New Roman Bold"/>
+          <w:b/>
+          <w:bCs/>
+          <w:sz w:val="30"/>
+          <w:szCs w:val="30"/>
+        </w:rPr>
+        <w:t xml:space="preserve">Appendix: Activity Guide</w:t>
+      </w:r>
+    </w:p>
+    <w:p>
+      <w:pPr/>
+      <w:r>
+        <w:rPr>
+          <w:rFonts w:hint="default" w:ascii="Times New Roman Regular" w:hAnsi="Times New Roman Regular" w:cs="Times New Roman Regular"/>
+          <w:sz w:val="24"/>
+          <w:szCs w:val="24"/>
+        </w:rPr>
+        <w:t xml:space="preserve">This appendix explains how to run each core activity: what it is, the steps, and facilitation notes. Before each session the facilitator fine-tunes pacing and depth based on the previous check-out and observation notes.</w:t>
+      </w:r>
+    </w:p>
+    <w:p>
+      <w:pPr/>
+      <w:r>
+        <w:rPr>
+          <w:rFonts w:hint="default" w:ascii="Times New Roman Bold" w:hAnsi="Times New Roman Bold" w:cs="Times New Roman Bold"/>
+          <w:b/>
+          <w:bCs/>
+          <w:sz w:val="26"/>
+          <w:szCs w:val="26"/>
+        </w:rPr>
+        <w:t xml:space="preserve">1. RIASEC Discussion (Session 2)</w:t>
+      </w:r>
+    </w:p>
+    <w:p>
+      <w:pPr/>
+      <w:r>
+        <w:rPr>
+          <w:rFonts w:hint="default" w:ascii="Times New Roman Bold" w:hAnsi="Times New Roman Bold" w:cs="Times New Roman Bold"/>
+          <w:b/>
+          <w:bCs/>
+          <w:sz w:val="24"/>
+          <w:szCs w:val="24"/>
+        </w:rPr>
+        <w:t xml:space="preserve">What it is. </w:t>
+      </w:r>
+      <w:r>
+        <w:rPr>
+          <w:rFonts w:hint="default" w:ascii="Times New Roman Regular" w:hAnsi="Times New Roman Regular" w:cs="Times New Roman Regular"/>
+          <w:sz w:val="24"/>
+          <w:szCs w:val="24"/>
+        </w:rPr>
+        <w:t xml:space="preserve">Holland's six interest types (Realistic, Investigative, Artistic, Social, Enterprising, Conventional) used as a discussion starter to widen members' vocabulary for “interest” — not as a diagnostic test.</w:t>
+      </w:r>
+    </w:p>
+    <w:p>
+      <w:pPr/>
+      <w:r>
+        <w:rPr>
+          <w:rFonts w:hint="default" w:ascii="Times New Roman Bold" w:hAnsi="Times New Roman Bold" w:cs="Times New Roman Bold"/>
+          <w:b/>
+          <w:bCs/>
+          <w:sz w:val="24"/>
+          <w:szCs w:val="24"/>
+        </w:rPr>
+        <w:t xml:space="preserve">Steps. </w:t>
+      </w:r>
+      <w:r>
+        <w:rPr>
+          <w:rFonts w:hint="default" w:ascii="Times New Roman Regular" w:hAnsi="Times New Roman Regular" w:cs="Times New Roman Regular"/>
+          <w:sz w:val="24"/>
+          <w:szCs w:val="24"/>
+        </w:rPr>
+        <w:t xml:space="preserve">On Miro, present the six zones, each with a short description and 3-4 example activities. Explain it is a vocabulary bank, not a verdict. Each member places their name on the 1-2 zones that feel most like them, then takes one minute to say why.</w:t>
+      </w:r>
+    </w:p>
+    <w:p>
+      <w:pPr/>
+      <w:r>
+        <w:rPr>
+          <w:rFonts w:hint="default" w:ascii="Times New Roman Bold" w:hAnsi="Times New Roman Bold" w:cs="Times New Roman Bold"/>
+          <w:b/>
+          <w:bCs/>
+          <w:sz w:val="24"/>
+          <w:szCs w:val="24"/>
+        </w:rPr>
+        <w:t xml:space="preserve">Facilitation. </w:t>
+      </w:r>
+      <w:r>
+        <w:rPr>
+          <w:rFonts w:hint="default" w:ascii="Times New Roman Regular" w:hAnsi="Times New Roman Regular" w:cs="Times New Roman Regular"/>
+          <w:sz w:val="24"/>
+          <w:szCs w:val="24"/>
+        </w:rPr>
+        <w:t xml:space="preserve">If someone says “I don't fit any,” normalise it — most people are mixed and may pick two or three. Reflect patterns (“several of you clustered around S and A”) rather than giving conclusions such as “you should do X.” Stress that the flow moments that follow will test these.</w:t>
+      </w:r>
+    </w:p>
+    <w:p>
+      <w:pPr/>
+      <w:r>
+        <w:rPr>
+          <w:rFonts w:hint="default" w:ascii="Times New Roman Bold" w:hAnsi="Times New Roman Bold" w:cs="Times New Roman Bold"/>
+          <w:b/>
+          <w:bCs/>
+          <w:sz w:val="26"/>
+          <w:szCs w:val="26"/>
+        </w:rPr>
+        <w:t xml:space="preserve">2. Flow Moments Recall (Session 2)</w:t>
+      </w:r>
+    </w:p>
+    <w:p>
+      <w:pPr/>
+      <w:r>
+        <w:rPr>
+          <w:rFonts w:hint="default" w:ascii="Times New Roman Bold" w:hAnsi="Times New Roman Bold" w:cs="Times New Roman Bold"/>
+          <w:b/>
+          <w:bCs/>
+          <w:sz w:val="24"/>
+          <w:szCs w:val="24"/>
+        </w:rPr>
+        <w:t xml:space="preserve">What it is. </w:t>
+      </w:r>
+      <w:r>
+        <w:rPr>
+          <w:rFonts w:hint="default" w:ascii="Times New Roman Regular" w:hAnsi="Times New Roman Regular" w:cs="Times New Roman Regular"/>
+          <w:sz w:val="24"/>
+          <w:szCs w:val="24"/>
+        </w:rPr>
+        <w:t xml:space="preserve">Members recall concrete “flow” experiences to surface real interest patterns.</w:t>
+      </w:r>
+    </w:p>
+    <w:p>
+      <w:pPr/>
+      <w:r>
+        <w:rPr>
+          <w:rFonts w:hint="default" w:ascii="Times New Roman Bold" w:hAnsi="Times New Roman Bold" w:cs="Times New Roman Bold"/>
+          <w:b/>
+          <w:bCs/>
+          <w:sz w:val="24"/>
+          <w:szCs w:val="24"/>
+        </w:rPr>
+        <w:t xml:space="preserve">Steps. </w:t>
+      </w:r>
+      <w:r>
+        <w:rPr>
+          <w:rFonts w:hint="default" w:ascii="Times New Roman Regular" w:hAnsi="Times New Roman Regular" w:cs="Times New Roman Regular"/>
+          <w:sz w:val="24"/>
+          <w:szCs w:val="24"/>
+        </w:rPr>
+        <w:t xml:space="preserve">The facilitator models one flow moment first (one minute: what they were doing, with whom, the setting, the body sensation). Members then write three flow scenes silently on Miro, one sticky note each, using the prompt what / who / where / body sensation.</w:t>
+      </w:r>
+    </w:p>
+    <w:p>
+      <w:pPr/>
+      <w:r>
+        <w:rPr>
+          <w:rFonts w:hint="default" w:ascii="Times New Roman Bold" w:hAnsi="Times New Roman Bold" w:cs="Times New Roman Bold"/>
+          <w:b/>
+          <w:bCs/>
+          <w:sz w:val="24"/>
+          <w:szCs w:val="24"/>
+        </w:rPr>
+        <w:t xml:space="preserve">Facilitation. </w:t>
+      </w:r>
+      <w:r>
+        <w:rPr>
+          <w:rFonts w:hint="default" w:ascii="Times New Roman Regular" w:hAnsi="Times New Roman Regular" w:cs="Times New Roman Regular"/>
+          <w:sz w:val="24"/>
+          <w:szCs w:val="24"/>
+        </w:rPr>
+        <w:t xml:space="preserve">If someone is stuck, prompt “think of the last time you forgot to eat” or “what leaves you with more energy than before?” If the answer is “gaming” or “scrolling,” don't judge — probe “what exactly absorbed you: solving puzzles, collaborating, creating?” Guide them to name the action (“creating something visual on my own”) rather than the activity label (“I like drawing”).</w:t>
+      </w:r>
+    </w:p>
+    <w:p>
+      <w:pPr/>
+      <w:r>
+        <w:rPr>
+          <w:rFonts w:hint="default" w:ascii="Times New Roman Bold" w:hAnsi="Times New Roman Bold" w:cs="Times New Roman Bold"/>
+          <w:b/>
+          <w:bCs/>
+          <w:sz w:val="26"/>
+          <w:szCs w:val="26"/>
+        </w:rPr>
+        <w:t xml:space="preserve">3. Zoom Breakout Rooms (Sessions 2, 4, 5, 6, 7)</w:t>
+      </w:r>
+    </w:p>
+    <w:p>
+      <w:pPr/>
+      <w:r>
+        <w:rPr>
+          <w:rFonts w:hint="default" w:ascii="Times New Roman Bold" w:hAnsi="Times New Roman Bold" w:cs="Times New Roman Bold"/>
+          <w:b/>
+          <w:bCs/>
+          <w:sz w:val="24"/>
+          <w:szCs w:val="24"/>
+        </w:rPr>
+        <w:t xml:space="preserve">Steps. </w:t>
+      </w:r>
+      <w:r>
+        <w:rPr>
+          <w:rFonts w:hint="default" w:ascii="Times New Roman Regular" w:hAnsi="Times New Roman Regular" w:cs="Times New Roman Regular"/>
+          <w:sz w:val="24"/>
+          <w:szCs w:val="24"/>
+        </w:rPr>
+        <w:t xml:space="preserve">As host, open Breakout Rooms from the toolbar; assign 2-3 per room; set the timer (e.g., 14 minutes for 7 minutes each); enable auto-close with countdown; broadcast a message at the halfway point (“please switch, the other person shares now”); rooms auto-return when time ends.</w:t>
+      </w:r>
+    </w:p>
+    <w:p>
+      <w:pPr/>
+      <w:r>
+        <w:rPr>
+          <w:rFonts w:hint="default" w:ascii="Times New Roman Bold" w:hAnsi="Times New Roman Bold" w:cs="Times New Roman Bold"/>
+          <w:b/>
+          <w:bCs/>
+          <w:sz w:val="24"/>
+          <w:szCs w:val="24"/>
+        </w:rPr>
+        <w:t xml:space="preserve">Notes. </w:t>
+      </w:r>
+      <w:r>
+        <w:rPr>
+          <w:rFonts w:hint="default" w:ascii="Times New Roman Regular" w:hAnsi="Times New Roman Regular" w:cs="Times New Roman Regular"/>
+          <w:sz w:val="24"/>
+          <w:szCs w:val="24"/>
+        </w:rPr>
+        <w:t xml:space="preserve">Tell members there may be a 2-3 second black screen on entering, which is normal. Demonstrate once the first time. For odd numbers, run one triad with slightly less time each.</w:t>
+      </w:r>
+    </w:p>
+    <w:p>
+      <w:pPr/>
+      <w:r>
+        <w:rPr>
+          <w:rFonts w:hint="default" w:ascii="Times New Roman Bold" w:hAnsi="Times New Roman Bold" w:cs="Times New Roman Bold"/>
+          <w:b/>
+          <w:bCs/>
+          <w:sz w:val="26"/>
+          <w:szCs w:val="26"/>
+        </w:rPr>
+        <w:t xml:space="preserve">4. Strengths Spotting (Session 3)</w:t>
+      </w:r>
+    </w:p>
+    <w:p>
+      <w:pPr/>
+      <w:r>
+        <w:rPr>
+          <w:rFonts w:hint="default" w:ascii="Times New Roman Bold" w:hAnsi="Times New Roman Bold" w:cs="Times New Roman Bold"/>
+          <w:b/>
+          <w:bCs/>
+          <w:sz w:val="24"/>
+          <w:szCs w:val="24"/>
+        </w:rPr>
+        <w:t xml:space="preserve">What it is. </w:t>
+      </w:r>
+      <w:r>
+        <w:rPr>
+          <w:rFonts w:hint="default" w:ascii="Times New Roman Regular" w:hAnsi="Times New Roman Regular" w:cs="Times New Roman Regular"/>
+          <w:sz w:val="24"/>
+          <w:szCs w:val="24"/>
+        </w:rPr>
+        <w:t xml:space="preserve">Members give each other specific strength observations based on real interactions in earlier sessions. This suits an online group of people who do not know each other well, replacing a “how friends see me” task that assumes existing relationships.</w:t>
+      </w:r>
+    </w:p>
+    <w:p>
+      <w:pPr/>
+      <w:r>
+        <w:rPr>
+          <w:rFonts w:hint="default" w:ascii="Times New Roman Bold" w:hAnsi="Times New Roman Bold" w:cs="Times New Roman Bold"/>
+          <w:b/>
+          <w:bCs/>
+          <w:sz w:val="24"/>
+          <w:szCs w:val="24"/>
+        </w:rPr>
+        <w:t xml:space="preserve">Steps. </w:t>
+      </w:r>
+      <w:r>
+        <w:rPr>
+          <w:rFonts w:hint="default" w:ascii="Times New Roman Regular" w:hAnsi="Times New Roman Regular" w:cs="Times New Roman Regular"/>
+          <w:sz w:val="24"/>
+          <w:szCs w:val="24"/>
+        </w:rPr>
+        <w:t xml:space="preserve">Each member is spotlighted for about three minutes; every other member offers one specific observation in the form “in [a moment in a session] I noticed you [specific behaviour], which suggests you have [a strength].” The spotlighted person only listens and records — no explaining, no deflecting.</w:t>
+      </w:r>
+    </w:p>
+    <w:p>
+      <w:pPr/>
+      <w:r>
+        <w:rPr>
+          <w:rFonts w:hint="default" w:ascii="Times New Roman Bold" w:hAnsi="Times New Roman Bold" w:cs="Times New Roman Bold"/>
+          <w:b/>
+          <w:bCs/>
+          <w:sz w:val="24"/>
+          <w:szCs w:val="24"/>
+        </w:rPr>
+        <w:t xml:space="preserve">Facilitation. </w:t>
+      </w:r>
+      <w:r>
+        <w:rPr>
+          <w:rFonts w:hint="default" w:ascii="Times New Roman Regular" w:hAnsi="Times New Roman Regular" w:cs="Times New Roman Regular"/>
+          <w:sz w:val="24"/>
+          <w:szCs w:val="24"/>
+        </w:rPr>
+        <w:t xml:space="preserve">If feedback is vague (“you're nice”), ask “what specific moment made you think that?” After each round, ask the spotlighted person “how was it to receive that — anything surprising?”</w:t>
+      </w:r>
+    </w:p>
+    <w:p>
+      <w:pPr/>
+      <w:r>
+        <w:rPr>
+          <w:rFonts w:hint="default" w:ascii="Times New Roman Bold" w:hAnsi="Times New Roman Bold" w:cs="Times New Roman Bold"/>
+          <w:b/>
+          <w:bCs/>
+          <w:sz w:val="26"/>
+          <w:szCs w:val="26"/>
+        </w:rPr>
+        <w:t xml:space="preserve">5. Values Card Sort and Source-Auditing (Session 4)</w:t>
+      </w:r>
+    </w:p>
+    <w:p>
+      <w:pPr/>
+      <w:r>
+        <w:rPr>
+          <w:rFonts w:hint="default" w:ascii="Times New Roman Bold" w:hAnsi="Times New Roman Bold" w:cs="Times New Roman Bold"/>
+          <w:b/>
+          <w:bCs/>
+          <w:sz w:val="24"/>
+          <w:szCs w:val="24"/>
+        </w:rPr>
+        <w:t xml:space="preserve">What it is. </w:t>
+      </w:r>
+      <w:r>
+        <w:rPr>
+          <w:rFonts w:hint="default" w:ascii="Times New Roman Regular" w:hAnsi="Times New Roman Regular" w:cs="Times New Roman Regular"/>
+          <w:sz w:val="24"/>
+          <w:szCs w:val="24"/>
+        </w:rPr>
+        <w:t xml:space="preserve">A 50-card forced-sort that surfaces core values, followed by checking where each value came from.</w:t>
+      </w:r>
+    </w:p>
+    <w:p>
+      <w:pPr/>
+      <w:r>
+        <w:rPr>
+          <w:rFonts w:hint="default" w:ascii="Times New Roman Bold" w:hAnsi="Times New Roman Bold" w:cs="Times New Roman Bold"/>
+          <w:b/>
+          <w:bCs/>
+          <w:sz w:val="24"/>
+          <w:szCs w:val="24"/>
+        </w:rPr>
+        <w:t xml:space="preserve">Steps. </w:t>
+      </w:r>
+      <w:r>
+        <w:rPr>
+          <w:rFonts w:hint="default" w:ascii="Times New Roman Regular" w:hAnsi="Times New Roman Regular" w:cs="Times New Roman Regular"/>
+          <w:sz w:val="24"/>
+          <w:szCs w:val="24"/>
+        </w:rPr>
+        <w:t xml:space="preserve">On Miro, members drag 50 value cards (one word plus one line each) into three zones: very important / somewhat / not important. Every zone must hold cards; follow the first reaction; don't overthink. Then circle the 5-7 most core values in the “very important” zone. For source-auditing, for each core value ask “is this mine, or did someone put it here?” and label the source; keeping or letting go are both allowed.</w:t>
+      </w:r>
+    </w:p>
+    <w:p>
+      <w:pPr/>
+      <w:r>
+        <w:rPr>
+          <w:rFonts w:hint="default" w:ascii="Times New Roman Bold" w:hAnsi="Times New Roman Bold" w:cs="Times New Roman Bold"/>
+          <w:b/>
+          <w:bCs/>
+          <w:sz w:val="24"/>
+          <w:szCs w:val="24"/>
+        </w:rPr>
+        <w:t xml:space="preserve">Facilitation. </w:t>
+      </w:r>
+      <w:r>
+        <w:rPr>
+          <w:rFonts w:hint="default" w:ascii="Times New Roman Regular" w:hAnsi="Times New Roman Regular" w:cs="Times New Roman Regular"/>
+          <w:sz w:val="24"/>
+          <w:szCs w:val="24"/>
+        </w:rPr>
+        <w:t xml:space="preserve">“Which was hardest to let go of? That one may be core.” No need to discuss every value — pick two or three that carry charge.</w:t>
+      </w:r>
+    </w:p>
+    <w:p>
+      <w:pPr/>
+      <w:r>
+        <w:rPr>
+          <w:rFonts w:hint="default" w:ascii="Times New Roman Bold" w:hAnsi="Times New Roman Bold" w:cs="Times New Roman Bold"/>
+          <w:b/>
+          <w:bCs/>
+          <w:sz w:val="26"/>
+          <w:szCs w:val="26"/>
+        </w:rPr>
+        <w:t xml:space="preserve">6. Role Models and Qualities (Session 5)</w:t>
+      </w:r>
+    </w:p>
+    <w:p>
+      <w:pPr/>
+      <w:r>
+        <w:rPr>
+          <w:rFonts w:hint="default" w:ascii="Times New Roman Bold" w:hAnsi="Times New Roman Bold" w:cs="Times New Roman Bold"/>
+          <w:b/>
+          <w:bCs/>
+          <w:sz w:val="24"/>
+          <w:szCs w:val="24"/>
+        </w:rPr>
+        <w:t xml:space="preserve">What it is. </w:t>
+      </w:r>
+      <w:r>
+        <w:rPr>
+          <w:rFonts w:hint="default" w:ascii="Times New Roman Regular" w:hAnsi="Times New Roman Regular" w:cs="Times New Roman Regular"/>
+          <w:sz w:val="24"/>
+          <w:szCs w:val="24"/>
+        </w:rPr>
+        <w:t xml:space="preserve">Members describe admired figures with adjectives to surface the personal qualities they want to embody (life-theme material; the Career Construction Interview's role-model question).</w:t>
+      </w:r>
+    </w:p>
+    <w:p>
+      <w:pPr/>
+      <w:r>
+        <w:rPr>
+          <w:rFonts w:hint="default" w:ascii="Times New Roman Bold" w:hAnsi="Times New Roman Bold" w:cs="Times New Roman Bold"/>
+          <w:b/>
+          <w:bCs/>
+          <w:sz w:val="24"/>
+          <w:szCs w:val="24"/>
+        </w:rPr>
+        <w:t xml:space="preserve">Steps. </w:t>
+      </w:r>
+      <w:r>
+        <w:rPr>
+          <w:rFonts w:hint="default" w:ascii="Times New Roman Regular" w:hAnsi="Times New Roman Regular" w:cs="Times New Roman Regular"/>
+          <w:sz w:val="24"/>
+          <w:szCs w:val="24"/>
+        </w:rPr>
+        <w:t xml:space="preserve">On Miro, each member names 2-3 people they admire (real, fictional, public, or personally known). For each, they write 3-5 adjectives describing what attracts them, then circle adjectives that repeat across figures or resonate most. In triads, members share their adjectives. Close by having each write “qualities I want to embody,” noting which they already have and which they wish they had more of.</w:t>
+      </w:r>
+    </w:p>
+    <w:p>
+      <w:pPr/>
+      <w:r>
+        <w:rPr>
+          <w:rFonts w:hint="default" w:ascii="Times New Roman Bold" w:hAnsi="Times New Roman Bold" w:cs="Times New Roman Bold"/>
+          <w:b/>
+          <w:bCs/>
+          <w:sz w:val="24"/>
+          <w:szCs w:val="24"/>
+        </w:rPr>
+        <w:t xml:space="preserve">Facilitation. </w:t>
+      </w:r>
+      <w:r>
+        <w:rPr>
+          <w:rFonts w:hint="default" w:ascii="Times New Roman Regular" w:hAnsi="Times New Roman Regular" w:cs="Times New Roman Regular"/>
+          <w:sz w:val="24"/>
+          <w:szCs w:val="24"/>
+        </w:rPr>
+        <w:t xml:space="preserve">Probe beneath surface words to reach the real quality — if someone says “pretty,” ask “what does that mean to you: confidence, being well-liked?” Use “how about you?” to invite quieter members and look for commonalities (“did anyone else pick a similar quality?”). After the breakout, you can ask one member to share what their partner described, which builds listening and connection.</w:t>
+      </w:r>
+    </w:p>
+    <w:p>
+      <w:pPr/>
+      <w:r>
+        <w:rPr>
+          <w:rFonts w:hint="default" w:ascii="Times New Roman Bold" w:hAnsi="Times New Roman Bold" w:cs="Times New Roman Bold"/>
+          <w:b/>
+          <w:bCs/>
+          <w:sz w:val="26"/>
+          <w:szCs w:val="26"/>
+        </w:rPr>
+        <w:t xml:space="preserve">7. “A Day in My Life” Drawing and Naming the Thread (Session 6)</w:t>
+      </w:r>
+    </w:p>
+    <w:p>
+      <w:pPr/>
+      <w:r>
+        <w:rPr>
+          <w:rFonts w:hint="default" w:ascii="Times New Roman Bold" w:hAnsi="Times New Roman Bold" w:cs="Times New Roman Bold"/>
+          <w:b/>
+          <w:bCs/>
+          <w:sz w:val="24"/>
+          <w:szCs w:val="24"/>
+        </w:rPr>
+        <w:t xml:space="preserve">What it is. </w:t>
+      </w:r>
+      <w:r>
+        <w:rPr>
+          <w:rFonts w:hint="default" w:ascii="Times New Roman Regular" w:hAnsi="Times New Roman Regular" w:cs="Times New Roman Regular"/>
+          <w:sz w:val="24"/>
+          <w:szCs w:val="24"/>
+        </w:rPr>
+        <w:t xml:space="preserve">An integrative session. Members first consolidate their Session 2-5 material into a self-portrait, then project it forward into one concrete imagined day. Nothing new is collected; the aim is to find the thread and turn it into an image.</w:t>
+      </w:r>
+    </w:p>
+    <w:p>
+      <w:pPr/>
+      <w:r>
+        <w:rPr>
+          <w:rFonts w:hint="default" w:ascii="Times New Roman Bold" w:hAnsi="Times New Roman Bold" w:cs="Times New Roman Bold"/>
+          <w:b/>
+          <w:bCs/>
+          <w:sz w:val="24"/>
+          <w:szCs w:val="24"/>
+        </w:rPr>
+        <w:t xml:space="preserve">Steps. </w:t>
+      </w:r>
+      <w:r>
+        <w:rPr>
+          <w:rFonts w:hint="default" w:ascii="Times New Roman Regular" w:hAnsi="Times New Roman Regular" w:cs="Times New Roman Regular"/>
+          <w:sz w:val="24"/>
+          <w:szCs w:val="24"/>
+        </w:rPr>
+        <w:t xml:space="preserve">Look back — each member revisits their own Session 2-5 Miro material, draws lines between things that connect, circles what repeats, and writes one sentence: “the thread I see in myself is ___.” Drawing — show a rough stick-figure example; the rules are stick figures are fine, no right or wrong, silence. Prompt: “five years from now, no limits, an ordinary Wednesday — draw the day that expresses your thread,” then draw 7-8 minutes in silence (remind “two minutes left”). In triads, members show the drawing and read their thread; listeners mirror back “what direction, value, or quality do I see in your day?” Each then writes 2-3 possible selves or directions.</w:t>
+      </w:r>
+    </w:p>
+    <w:p>
+      <w:pPr/>
+      <w:r>
+        <w:rPr>
+          <w:rFonts w:hint="default" w:ascii="Times New Roman Bold" w:hAnsi="Times New Roman Bold" w:cs="Times New Roman Bold"/>
+          <w:b/>
+          <w:bCs/>
+          <w:sz w:val="24"/>
+          <w:szCs w:val="24"/>
+        </w:rPr>
+        <w:t xml:space="preserve">Facilitation. </w:t>
+      </w:r>
+      <w:r>
+        <w:rPr>
+          <w:rFonts w:hint="default" w:ascii="Times New Roman Regular" w:hAnsi="Times New Roman Regular" w:cs="Times New Roman Regular"/>
+          <w:sz w:val="24"/>
+          <w:szCs w:val="24"/>
+        </w:rPr>
+        <w:t xml:space="preserve">Reflect only; don't interpret for them. Ask “what appeared that you didn't plan to draw?” and “which direction makes your body react — excitement and fear are both signals.” If a member is stuck naming the thread, ask about a film or story they keep returning to; its plot often mirrors their own.</w:t>
+      </w:r>
+    </w:p>
+    <w:p>
+      <w:pPr/>
+      <w:r>
+        <w:rPr>
+          <w:rFonts w:hint="default" w:ascii="Times New Roman Bold" w:hAnsi="Times New Roman Bold" w:cs="Times New Roman Bold"/>
+          <w:b/>
+          <w:bCs/>
+          <w:sz w:val="26"/>
+          <w:szCs w:val="26"/>
+        </w:rPr>
+        <w:t xml:space="preserve">8. Imagination vs Reality (Session 7)</w:t>
+      </w:r>
+    </w:p>
+    <w:p>
+      <w:pPr/>
+      <w:r>
+        <w:rPr>
+          <w:rFonts w:hint="default" w:ascii="Times New Roman Bold" w:hAnsi="Times New Roman Bold" w:cs="Times New Roman Bold"/>
+          <w:b/>
+          <w:bCs/>
+          <w:sz w:val="24"/>
+          <w:szCs w:val="24"/>
+        </w:rPr>
+        <w:t xml:space="preserve">What it is. </w:t>
+      </w:r>
+      <w:r>
+        <w:rPr>
+          <w:rFonts w:hint="default" w:ascii="Times New Roman Regular" w:hAnsi="Times New Roman Regular" w:cs="Times New Roman Regular"/>
+          <w:sz w:val="24"/>
+          <w:szCs w:val="24"/>
+        </w:rPr>
+        <w:t xml:space="preserve">Members test the direction they imagined against what they learned from a real-world reality check (the Session 6 homework conversation).</w:t>
+      </w:r>
+    </w:p>
+    <w:p>
+      <w:pPr/>
+      <w:r>
+        <w:rPr>
+          <w:rFonts w:hint="default" w:ascii="Times New Roman Bold" w:hAnsi="Times New Roman Bold" w:cs="Times New Roman Bold"/>
+          <w:b/>
+          <w:bCs/>
+          <w:sz w:val="24"/>
+          <w:szCs w:val="24"/>
+        </w:rPr>
+        <w:t xml:space="preserve">Steps. </w:t>
+      </w:r>
+      <w:r>
+        <w:rPr>
+          <w:rFonts w:hint="default" w:ascii="Times New Roman Regular" w:hAnsi="Times New Roman Regular" w:cs="Times New Roman Regular"/>
+          <w:sz w:val="24"/>
+          <w:szCs w:val="24"/>
+        </w:rPr>
+        <w:t xml:space="preserve">On Miro, two columns — left, how I imagined this direction; right, what I actually learned. Mark where they match and where the gap is, and ask whether the gap pulls them closer or makes them hesitate. Share in triads with open questions (“what does that gap feel like? are you more curious or more hesitant now?”).</w:t>
+      </w:r>
+    </w:p>
+    <w:p>
+      <w:pPr/>
+      <w:r>
+        <w:rPr>
+          <w:rFonts w:hint="default" w:ascii="Times New Roman Bold" w:hAnsi="Times New Roman Bold" w:cs="Times New Roman Bold"/>
+          <w:b/>
+          <w:bCs/>
+          <w:sz w:val="24"/>
+          <w:szCs w:val="24"/>
+        </w:rPr>
+        <w:t xml:space="preserve">Facilitation. </w:t>
+      </w:r>
+      <w:r>
+        <w:rPr>
+          <w:rFonts w:hint="default" w:ascii="Times New Roman Regular" w:hAnsi="Times New Roman Regular" w:cs="Times New Roman Regular"/>
+          <w:sz w:val="24"/>
+          <w:szCs w:val="24"/>
+        </w:rPr>
+        <w:t xml:space="preserve">Keep it exploratory, not evaluative; a gap is information, not failure. Resist rushing members to a decision.</w:t>
+      </w:r>
+    </w:p>
+    <w:p>
+      <w:pPr/>
+      <w:r>
+        <w:rPr>
+          <w:rFonts w:hint="default" w:ascii="Times New Roman Bold" w:hAnsi="Times New Roman Bold" w:cs="Times New Roman Bold"/>
+          <w:b/>
+          <w:bCs/>
+          <w:sz w:val="26"/>
+          <w:szCs w:val="26"/>
+        </w:rPr>
+        <w:t xml:space="preserve">9. Favourite Motto as Compass (Session 7)</w:t>
+      </w:r>
+    </w:p>
+    <w:p>
+      <w:pPr/>
+      <w:r>
+        <w:rPr>
+          <w:rFonts w:hint="default" w:ascii="Times New Roman Bold" w:hAnsi="Times New Roman Bold" w:cs="Times New Roman Bold"/>
+          <w:b/>
+          <w:bCs/>
+          <w:sz w:val="24"/>
+          <w:szCs w:val="24"/>
+        </w:rPr>
+        <w:t xml:space="preserve">What it is. </w:t>
+      </w:r>
+      <w:r>
+        <w:rPr>
+          <w:rFonts w:hint="default" w:ascii="Times New Roman Regular" w:hAnsi="Times New Roman Regular" w:cs="Times New Roman Regular"/>
+          <w:sz w:val="24"/>
+          <w:szCs w:val="24"/>
+        </w:rPr>
+        <w:t xml:space="preserve">The Career Construction Interview's “favourite saying” question, used as a compass at the moment of choosing.</w:t>
+      </w:r>
+    </w:p>
+    <w:p>
+      <w:pPr/>
+      <w:r>
+        <w:rPr>
+          <w:rFonts w:hint="default" w:ascii="Times New Roman Bold" w:hAnsi="Times New Roman Bold" w:cs="Times New Roman Bold"/>
+          <w:b/>
+          <w:bCs/>
+          <w:sz w:val="24"/>
+          <w:szCs w:val="24"/>
+        </w:rPr>
+        <w:t xml:space="preserve">Steps. </w:t>
+      </w:r>
+      <w:r>
+        <w:rPr>
+          <w:rFonts w:hint="default" w:ascii="Times New Roman Regular" w:hAnsi="Times New Roman Regular" w:cs="Times New Roman Regular"/>
+          <w:sz w:val="24"/>
+          <w:szCs w:val="24"/>
+        </w:rPr>
+        <w:t xml:space="preserve">Just before narrowing to a direction, ask “what is a saying or motto you live by? It is really the advice you would give yourself right now.” Members write it on Miro and share briefly, then check their emerging direction against it (“does the motto point this way?”).</w:t>
+      </w:r>
+    </w:p>
+    <w:p>
+      <w:pPr/>
+      <w:r>
+        <w:rPr>
+          <w:rFonts w:hint="default" w:ascii="Times New Roman Bold" w:hAnsi="Times New Roman Bold" w:cs="Times New Roman Bold"/>
+          <w:b/>
+          <w:bCs/>
+          <w:sz w:val="26"/>
+          <w:szCs w:val="26"/>
+        </w:rPr>
+        <w:t xml:space="preserve">10. Action Plan — What / Why / When / Done / Block (Session 8)</w:t>
+      </w:r>
+    </w:p>
+    <w:p>
+      <w:pPr/>
+      <w:r>
+        <w:rPr>
+          <w:rFonts w:hint="default" w:ascii="Times New Roman Bold" w:hAnsi="Times New Roman Bold" w:cs="Times New Roman Bold"/>
+          <w:b/>
+          <w:bCs/>
+          <w:sz w:val="24"/>
+          <w:szCs w:val="24"/>
+        </w:rPr>
+        <w:t xml:space="preserve">What it is. </w:t>
+      </w:r>
+      <w:r>
+        <w:rPr>
+          <w:rFonts w:hint="default" w:ascii="Times New Roman Regular" w:hAnsi="Times New Roman Regular" w:cs="Times New Roman Regular"/>
+          <w:sz w:val="24"/>
+          <w:szCs w:val="24"/>
+        </w:rPr>
+        <w:t xml:space="preserve">One concrete, values-aligned step, made specific enough to start.</w:t>
+      </w:r>
+    </w:p>
+    <w:p>
+      <w:pPr/>
+      <w:r>
+        <w:rPr>
+          <w:rFonts w:hint="default" w:ascii="Times New Roman Bold" w:hAnsi="Times New Roman Bold" w:cs="Times New Roman Bold"/>
+          <w:b/>
+          <w:bCs/>
+          <w:sz w:val="24"/>
+          <w:szCs w:val="24"/>
+        </w:rPr>
+        <w:t xml:space="preserve">Steps. </w:t>
+      </w:r>
+      <w:r>
+        <w:rPr>
+          <w:rFonts w:hint="default" w:ascii="Times New Roman Regular" w:hAnsi="Times New Roman Regular" w:cs="Times New Roman Regular"/>
+          <w:sz w:val="24"/>
+          <w:szCs w:val="24"/>
+        </w:rPr>
+        <w:t xml:space="preserve">Each member writes five fields on Miro — What (the step), Why (which value it serves), When, Done (how I'll know it is complete), Block (what might stop me and my plan for it). Self-check: “can I start this right now?” If not, break it smaller. Members then state their step aloud; others respond with what they heard, the value it connects to, and how they could support it.</w:t>
+      </w:r>
+    </w:p>
+    <w:p>
+      <w:pPr/>
+      <w:r>
+        <w:rPr>
+          <w:rFonts w:hint="default" w:ascii="Times New Roman Bold" w:hAnsi="Times New Roman Bold" w:cs="Times New Roman Bold"/>
+          <w:b/>
+          <w:bCs/>
+          <w:sz w:val="24"/>
+          <w:szCs w:val="24"/>
+        </w:rPr>
+        <w:t xml:space="preserve">Facilitation. </w:t>
+      </w:r>
+      <w:r>
+        <w:rPr>
+          <w:rFonts w:hint="default" w:ascii="Times New Roman Regular" w:hAnsi="Times New Roman Regular" w:cs="Times New Roman Regular"/>
+          <w:sz w:val="24"/>
+          <w:szCs w:val="24"/>
+        </w:rPr>
+        <w:t xml:space="preserve">A “step” is “have coffee with X on Wednesday,” not “find a job” — startable and completable within about two weeks.</w:t>
+      </w:r>
     </w:p>
     <w:sectPr>
       <w:pgSz w:w="11906" w:h="16838"/>

</xml_diff>